<commit_message>
add "piped list", remove unused files
</commit_message>
<xml_diff>
--- a/src/templates/word-styles2.docx
+++ b/src/templates/word-styles2.docx
@@ -5,6 +5,10 @@
     <w:p>
       <w:pPr>
         <w:pStyle w:val="Title"/>
+        <w:numPr>
+          <w:ilvl w:val="0"/>
+          <w:numId w:val="1"/>
+        </w:numPr>
         <w:rPr/>
       </w:pPr>
       <w:r>
@@ -234,7 +238,6 @@
         <w:tblW w:w="5000" w:type="pct"/>
         <w:jc w:val="left"/>
         <w:tblInd w:w="108" w:type="dxa"/>
-        <w:shd w:fill="CCCCCC" w:val="clear"/>
         <w:tblLayout w:type="fixed"/>
         <w:tblCellMar>
           <w:top w:w="0" w:type="dxa"/>
@@ -265,6 +268,7 @@
             <w:pPr>
               <w:pStyle w:val="Compact"/>
               <w:widowControl/>
+              <w:suppressAutoHyphens w:val="true"/>
               <w:spacing w:before="36" w:after="36"/>
               <w:jc w:val="left"/>
               <w:rPr>
@@ -300,6 +304,7 @@
             <w:pPr>
               <w:pStyle w:val="Compact"/>
               <w:widowControl/>
+              <w:suppressAutoHyphens w:val="true"/>
               <w:spacing w:before="36" w:after="36"/>
               <w:jc w:val="left"/>
               <w:rPr>
@@ -335,6 +340,7 @@
             <w:pPr>
               <w:pStyle w:val="Compact"/>
               <w:widowControl/>
+              <w:suppressAutoHyphens w:val="true"/>
               <w:spacing w:before="36" w:after="36"/>
               <w:jc w:val="left"/>
               <w:rPr>
@@ -367,6 +373,7 @@
             <w:pPr>
               <w:pStyle w:val="Compact"/>
               <w:widowControl/>
+              <w:suppressAutoHyphens w:val="true"/>
               <w:spacing w:before="36" w:after="36"/>
               <w:jc w:val="left"/>
               <w:rPr>
@@ -528,6 +535,246 @@
 </w:footnotes>
 </file>
 
+<file path=word/numbering.xml><?xml version="1.0" encoding="utf-8"?>
+<w:numbering xmlns:w="http://schemas.openxmlformats.org/wordprocessingml/2006/main" xmlns:o="urn:schemas-microsoft-com:office:office" xmlns:r="http://schemas.openxmlformats.org/officeDocument/2006/relationships" xmlns:v="urn:schemas-microsoft-com:vml" xmlns:mc="http://schemas.openxmlformats.org/markup-compatibility/2006" xmlns:w14="http://schemas.microsoft.com/office/word/2010/wordml" mc:Ignorable="w14">
+  <w:abstractNum w:abstractNumId="1">
+    <w:lvl w:ilvl="0">
+      <w:start w:val="1"/>
+      <w:numFmt w:val="decimal"/>
+      <w:lvlText w:val="%1."/>
+      <w:lvlJc w:val="left"/>
+      <w:pPr>
+        <w:tabs>
+          <w:tab w:val="num" w:pos="0"/>
+        </w:tabs>
+        <w:ind w:left="288" w:hanging="288"/>
+      </w:pPr>
+    </w:lvl>
+    <w:lvl w:ilvl="1">
+      <w:start w:val="1"/>
+      <w:numFmt w:val="decimal"/>
+      <w:lvlText w:val="%2."/>
+      <w:lvlJc w:val="left"/>
+      <w:pPr>
+        <w:tabs>
+          <w:tab w:val="num" w:pos="1080"/>
+        </w:tabs>
+        <w:ind w:left="1080" w:hanging="360"/>
+      </w:pPr>
+    </w:lvl>
+    <w:lvl w:ilvl="2">
+      <w:start w:val="1"/>
+      <w:numFmt w:val="decimal"/>
+      <w:lvlText w:val="%3."/>
+      <w:lvlJc w:val="left"/>
+      <w:pPr>
+        <w:tabs>
+          <w:tab w:val="num" w:pos="1440"/>
+        </w:tabs>
+        <w:ind w:left="1440" w:hanging="360"/>
+      </w:pPr>
+    </w:lvl>
+    <w:lvl w:ilvl="3">
+      <w:start w:val="1"/>
+      <w:numFmt w:val="decimal"/>
+      <w:lvlText w:val="%4."/>
+      <w:lvlJc w:val="left"/>
+      <w:pPr>
+        <w:tabs>
+          <w:tab w:val="num" w:pos="1800"/>
+        </w:tabs>
+        <w:ind w:left="1800" w:hanging="360"/>
+      </w:pPr>
+    </w:lvl>
+    <w:lvl w:ilvl="4">
+      <w:start w:val="1"/>
+      <w:numFmt w:val="decimal"/>
+      <w:lvlText w:val="%5."/>
+      <w:lvlJc w:val="left"/>
+      <w:pPr>
+        <w:tabs>
+          <w:tab w:val="num" w:pos="2160"/>
+        </w:tabs>
+        <w:ind w:left="2160" w:hanging="360"/>
+      </w:pPr>
+    </w:lvl>
+    <w:lvl w:ilvl="5">
+      <w:start w:val="1"/>
+      <w:numFmt w:val="decimal"/>
+      <w:lvlText w:val="%6."/>
+      <w:lvlJc w:val="left"/>
+      <w:pPr>
+        <w:tabs>
+          <w:tab w:val="num" w:pos="2520"/>
+        </w:tabs>
+        <w:ind w:left="2520" w:hanging="360"/>
+      </w:pPr>
+    </w:lvl>
+    <w:lvl w:ilvl="6">
+      <w:start w:val="1"/>
+      <w:numFmt w:val="decimal"/>
+      <w:lvlText w:val="%7."/>
+      <w:lvlJc w:val="left"/>
+      <w:pPr>
+        <w:tabs>
+          <w:tab w:val="num" w:pos="2880"/>
+        </w:tabs>
+        <w:ind w:left="2880" w:hanging="360"/>
+      </w:pPr>
+    </w:lvl>
+    <w:lvl w:ilvl="7">
+      <w:start w:val="1"/>
+      <w:numFmt w:val="decimal"/>
+      <w:lvlText w:val="%8."/>
+      <w:lvlJc w:val="left"/>
+      <w:pPr>
+        <w:tabs>
+          <w:tab w:val="num" w:pos="3240"/>
+        </w:tabs>
+        <w:ind w:left="3240" w:hanging="360"/>
+      </w:pPr>
+    </w:lvl>
+    <w:lvl w:ilvl="8">
+      <w:start w:val="1"/>
+      <w:numFmt w:val="decimal"/>
+      <w:lvlText w:val="%9."/>
+      <w:lvlJc w:val="left"/>
+      <w:pPr>
+        <w:tabs>
+          <w:tab w:val="num" w:pos="3600"/>
+        </w:tabs>
+        <w:ind w:left="3600" w:hanging="360"/>
+      </w:pPr>
+    </w:lvl>
+  </w:abstractNum>
+  <w:abstractNum w:abstractNumId="2">
+    <w:lvl w:ilvl="0">
+      <w:start w:val="1"/>
+      <w:numFmt w:val="none"/>
+      <w:suff w:val="nothing"/>
+      <w:lvlText w:val=""/>
+      <w:lvlJc w:val="left"/>
+      <w:pPr>
+        <w:tabs>
+          <w:tab w:val="num" w:pos="0"/>
+        </w:tabs>
+        <w:ind w:left="0" w:hanging="0"/>
+      </w:pPr>
+    </w:lvl>
+    <w:lvl w:ilvl="1">
+      <w:start w:val="1"/>
+      <w:numFmt w:val="none"/>
+      <w:suff w:val="nothing"/>
+      <w:lvlText w:val=""/>
+      <w:lvlJc w:val="left"/>
+      <w:pPr>
+        <w:tabs>
+          <w:tab w:val="num" w:pos="0"/>
+        </w:tabs>
+        <w:ind w:left="0" w:hanging="0"/>
+      </w:pPr>
+    </w:lvl>
+    <w:lvl w:ilvl="2">
+      <w:start w:val="1"/>
+      <w:numFmt w:val="none"/>
+      <w:suff w:val="nothing"/>
+      <w:lvlText w:val=""/>
+      <w:lvlJc w:val="left"/>
+      <w:pPr>
+        <w:tabs>
+          <w:tab w:val="num" w:pos="0"/>
+        </w:tabs>
+        <w:ind w:left="0" w:hanging="0"/>
+      </w:pPr>
+    </w:lvl>
+    <w:lvl w:ilvl="3">
+      <w:start w:val="1"/>
+      <w:numFmt w:val="none"/>
+      <w:suff w:val="nothing"/>
+      <w:lvlText w:val=""/>
+      <w:lvlJc w:val="left"/>
+      <w:pPr>
+        <w:tabs>
+          <w:tab w:val="num" w:pos="0"/>
+        </w:tabs>
+        <w:ind w:left="0" w:hanging="0"/>
+      </w:pPr>
+    </w:lvl>
+    <w:lvl w:ilvl="4">
+      <w:start w:val="1"/>
+      <w:numFmt w:val="none"/>
+      <w:suff w:val="nothing"/>
+      <w:lvlText w:val=""/>
+      <w:lvlJc w:val="left"/>
+      <w:pPr>
+        <w:tabs>
+          <w:tab w:val="num" w:pos="0"/>
+        </w:tabs>
+        <w:ind w:left="0" w:hanging="0"/>
+      </w:pPr>
+    </w:lvl>
+    <w:lvl w:ilvl="5">
+      <w:start w:val="1"/>
+      <w:numFmt w:val="none"/>
+      <w:suff w:val="nothing"/>
+      <w:lvlText w:val=""/>
+      <w:lvlJc w:val="left"/>
+      <w:pPr>
+        <w:tabs>
+          <w:tab w:val="num" w:pos="0"/>
+        </w:tabs>
+        <w:ind w:left="0" w:hanging="0"/>
+      </w:pPr>
+    </w:lvl>
+    <w:lvl w:ilvl="6">
+      <w:start w:val="1"/>
+      <w:numFmt w:val="none"/>
+      <w:suff w:val="nothing"/>
+      <w:lvlText w:val=""/>
+      <w:lvlJc w:val="left"/>
+      <w:pPr>
+        <w:tabs>
+          <w:tab w:val="num" w:pos="0"/>
+        </w:tabs>
+        <w:ind w:left="0" w:hanging="0"/>
+      </w:pPr>
+    </w:lvl>
+    <w:lvl w:ilvl="7">
+      <w:start w:val="1"/>
+      <w:numFmt w:val="none"/>
+      <w:suff w:val="nothing"/>
+      <w:lvlText w:val=""/>
+      <w:lvlJc w:val="left"/>
+      <w:pPr>
+        <w:tabs>
+          <w:tab w:val="num" w:pos="0"/>
+        </w:tabs>
+        <w:ind w:left="0" w:hanging="0"/>
+      </w:pPr>
+    </w:lvl>
+    <w:lvl w:ilvl="8">
+      <w:start w:val="1"/>
+      <w:numFmt w:val="none"/>
+      <w:suff w:val="nothing"/>
+      <w:lvlText w:val=""/>
+      <w:lvlJc w:val="left"/>
+      <w:pPr>
+        <w:tabs>
+          <w:tab w:val="num" w:pos="0"/>
+        </w:tabs>
+        <w:ind w:left="0" w:hanging="0"/>
+      </w:pPr>
+    </w:lvl>
+  </w:abstractNum>
+  <w:num w:numId="1">
+    <w:abstractNumId w:val="1"/>
+  </w:num>
+  <w:num w:numId="2">
+    <w:abstractNumId w:val="2"/>
+  </w:num>
+</w:numbering>
+</file>
+
 <file path=word/styles.xml><?xml version="1.0" encoding="utf-8"?>
 <w:styles xmlns:w="http://schemas.openxmlformats.org/wordprocessingml/2006/main" xmlns:w14="http://schemas.microsoft.com/office/word/2010/wordml" xmlns:mc="http://schemas.openxmlformats.org/markup-compatibility/2006" mc:Ignorable="w14">
   <w:docDefaults>
@@ -551,6 +798,7 @@
     <w:qFormat/>
     <w:pPr>
       <w:widowControl/>
+      <w:suppressAutoHyphens w:val="true"/>
       <w:bidi w:val="0"/>
       <w:spacing w:before="0" w:after="200"/>
       <w:jc w:val="left"/>
@@ -646,10 +894,13 @@
       <w:keepNext w:val="true"/>
       <w:keepLines/>
       <w:spacing w:before="80" w:after="40"/>
+      <w:jc w:val="center"/>
       <w:outlineLvl w:val="3"/>
     </w:pPr>
     <w:rPr>
       <w:rFonts w:eastAsia="" w:cs="" w:cstheme="majorBidi" w:eastAsiaTheme="majorEastAsia"/>
+      <w:b/>
+      <w:bCs/>
       <w:i/>
       <w:iCs/>
       <w:color w:themeColor="accent1" w:themeShade="bf" w:val="0F4761"/>
@@ -694,9 +945,11 @@
     </w:pPr>
     <w:rPr>
       <w:rFonts w:eastAsia="" w:cs="" w:cstheme="majorBidi" w:eastAsiaTheme="majorEastAsia"/>
-      <w:i/>
-      <w:iCs/>
-      <w:color w:themeColor="text1" w:themeTint="a6" w:val="595959"/>
+      <w:b/>
+      <w:bCs/>
+      <w:i w:val="false"/>
+      <w:iCs w:val="false"/>
+      <w:color w:val="000000"/>
     </w:rPr>
   </w:style>
   <w:style w:type="paragraph" w:styleId="Heading7">
@@ -950,7 +1203,6 @@
   </w:style>
   <w:style w:type="character" w:styleId="FootnoteCharacters">
     <w:name w:val="Footnote Characters"/>
-    <w:basedOn w:val="BodyTextChar"/>
     <w:qFormat/>
     <w:rPr>
       <w:vertAlign w:val="superscript"/>
@@ -969,16 +1221,18 @@
       <w:color w:themeColor="accent1" w:val="4F81BD"/>
     </w:rPr>
   </w:style>
+  <w:style w:type="character" w:styleId="EndnoteCharacters">
+    <w:name w:val="Endnote Characters"/>
+    <w:qFormat/>
+    <w:rPr>
+      <w:vertAlign w:val="superscript"/>
+    </w:rPr>
+  </w:style>
   <w:style w:type="character" w:styleId="EndnoteReference">
     <w:name w:val="Endnote Reference"/>
     <w:rPr>
       <w:vertAlign w:val="superscript"/>
     </w:rPr>
-  </w:style>
-  <w:style w:type="character" w:styleId="EndnoteCharacters">
-    <w:name w:val="Endnote Characters"/>
-    <w:qFormat/>
-    <w:rPr/>
   </w:style>
   <w:style w:type="paragraph" w:styleId="Heading">
     <w:name w:val="Heading"/>

</xml_diff>